<commit_message>
fix: route M3 owner brief through mainland Token Plan
</commit_message>
<xml_diff>
--- a/docs/SMARTFLOW_M3_OWNER_BRIEF_PROPOSAL.docx
+++ b/docs/SMARTFLOW_M3_OWNER_BRIEF_PROPOSAL.docx
@@ -356,7 +356,7 @@
           <w:color w:val="1F4D78"/>
           <w:sz w:val="19"/>
         </w:rPr>
-        <w:t>MiniMax-M3</w:t>
+        <w:t>MiniMax-M3 (Mainland China Token Plan)</w:t>
       </w:r>
       <w:r>
         <w:rPr>
@@ -1031,7 +1031,7 @@
         <w:br/>
         <w:t xml:space="preserve">          v</w:t>
         <w:br/>
-        <w:t>MiniMax-M3 narrative</w:t>
+        <w:t>MiniMax-M3 (Mainland China Token Plan) narrative</w:t>
         <w:br/>
         <w:t xml:space="preserve">          |</w:t>
         <w:br/>
@@ -1600,7 +1600,7 @@
         <w:pageBreakBefore/>
       </w:pPr>
       <w:r>
-        <w:t>5. MiniMax-M3 design</w:t>
+        <w:t>5. MiniMax-M3 (Mainland China Token Plan) design</w:t>
       </w:r>
     </w:p>
     <w:p>
@@ -1627,7 +1627,7 @@
           <w:color w:val="1F4D78"/>
           <w:sz w:val="19"/>
         </w:rPr>
-        <w:t>MiniMax-M3</w:t>
+        <w:t>MiniMax-M3 (Mainland China Token Plan)</w:t>
       </w:r>
     </w:p>
     <w:p>
@@ -1646,7 +1646,7 @@
           <w:color w:val="1F4D78"/>
           <w:sz w:val="19"/>
         </w:rPr>
-        <w:t>https://api.minimax.io/v1/chat/completions</w:t>
+        <w:t>https://api.minimaxi.com/v1/text/chatcompletion_v2</w:t>
       </w:r>
     </w:p>
     <w:p>
@@ -1668,7 +1668,7 @@
         <w:rPr>
           <w:rFonts w:ascii="Calibri" w:hAnsi="Calibri" w:eastAsia="Microsoft JhengHei"/>
         </w:rPr>
-        <w:t>Maximum completion: bounded</w:t>
+        <w:t>Maximum completion: 4,096 tokens (bounded)</w:t>
       </w:r>
     </w:p>
     <w:p>
@@ -2634,7 +2634,7 @@
           <w:color w:val="1F4D78"/>
           <w:sz w:val="19"/>
         </w:rPr>
-        <w:t>api.minimax.io</w:t>
+        <w:t>api.minimaxi.com</w:t>
       </w:r>
       <w:r>
         <w:rPr>
@@ -4390,7 +4390,7 @@
         <w:rPr>
           <w:rFonts w:ascii="Calibri" w:hAnsi="Calibri" w:eastAsia="Microsoft JhengHei"/>
         </w:rPr>
-        <w:t>active Lambda MiniMax-M3 environment configuration；</w:t>
+        <w:t>active Lambda MiniMax-M3 (Mainland China Token Plan) environment configuration；</w:t>
       </w:r>
     </w:p>
     <w:p>
@@ -4520,7 +4520,7 @@
         <w:rPr>
           <w:rFonts w:ascii="Calibri" w:hAnsi="Calibri" w:eastAsia="Microsoft JhengHei"/>
         </w:rPr>
-        <w:t>MiniMax API Overview and supported M3 model: https://platform.minimax.io/docs/api-reference/api-overview</w:t>
+        <w:t>MiniMax Mainland API Overview: https://platform.minimaxi.com/docs/api-reference/api-overview</w:t>
       </w:r>
     </w:p>
     <w:p>
@@ -4531,7 +4531,7 @@
         <w:rPr>
           <w:rFonts w:ascii="Calibri" w:hAnsi="Calibri" w:eastAsia="Microsoft JhengHei"/>
         </w:rPr>
-        <w:t>MiniMax OpenAI-compatible Chat Completions: https://platform.minimax.io/docs/api-reference/text-chat-openai</w:t>
+        <w:t>MiniMax M3 Mainland endpoint: https://www.minimaxi.com/models/text/m3</w:t>
       </w:r>
     </w:p>
     <w:p>
@@ -4542,7 +4542,7 @@
         <w:rPr>
           <w:rFonts w:ascii="Calibri" w:hAnsi="Calibri" w:eastAsia="Microsoft JhengHei"/>
         </w:rPr>
-        <w:t>MiniMax Token Plan: https://platform.minimax.io/subscribe/token-plan</w:t>
+        <w:t>MiniMax Mainland Token Plan: https://platform.minimaxi.com/subscribe/token-plan</w:t>
       </w:r>
     </w:p>
     <w:p>
@@ -4553,7 +4553,7 @@
         <w:rPr>
           <w:rFonts w:ascii="Calibri" w:hAnsi="Calibri" w:eastAsia="Microsoft JhengHei"/>
         </w:rPr>
-        <w:t>MiniMax API Privacy Policy: https://platform.minimax.io/protocol/privacy-policy</w:t>
+        <w:t>MiniMax Mainland API FAQ: https://platform.minimaxi.com/docs/faq/about-apis</w:t>
       </w:r>
     </w:p>
     <w:p>

</xml_diff>